<commit_message>
Update final PZ formatting to GOST-like page layout
</commit_message>
<xml_diff>
--- a/docs/pz/PZ_IS_CPK_FINAL.docx
+++ b/docs/pz/PZ_IS_CPK_FINAL.docx
@@ -11,7 +11,7 @@
         <w:rPr>
           <w:b w:val="0"/>
         </w:rPr>
-        <w:t>Федеральное государственное бюджетное образовательное учреждение высшего образования</w:t>
+        <w:t>Федеральное государственное образовательное бюджетное учреждение высшего образования</w:t>
       </w:r>
     </w:p>
     <w:p>
@@ -35,7 +35,19 @@
         <w:rPr>
           <w:b w:val="0"/>
         </w:rPr>
-        <w:t>Департамент анализа данных и машинного обучения</w:t>
+        <w:t>(Финансовый университет)</w:t>
+      </w:r>
+    </w:p>
+    <w:p>
+      <w:pPr>
+        <w:spacing w:line="360" w:lineRule="auto" w:after="0" w:before="0"/>
+        <w:jc w:val="center"/>
+      </w:pPr>
+      <w:r>
+        <w:rPr>
+          <w:b w:val="0"/>
+        </w:rPr>
+        <w:t>Кафедра информационных технологий</w:t>
       </w:r>
     </w:p>
     <w:p/>
@@ -4364,16 +4376,16 @@
         <w:tblLook w:firstColumn="1" w:firstRow="1" w:lastColumn="0" w:lastRow="0" w:noHBand="0" w:noVBand="1" w:val="04A0"/>
       </w:tblPr>
       <w:tblGrid>
-        <w:gridCol w:w="1871"/>
-        <w:gridCol w:w="1871"/>
-        <w:gridCol w:w="1871"/>
-        <w:gridCol w:w="1871"/>
-        <w:gridCol w:w="1871"/>
+        <w:gridCol w:w="1928"/>
+        <w:gridCol w:w="1928"/>
+        <w:gridCol w:w="1928"/>
+        <w:gridCol w:w="1928"/>
+        <w:gridCol w:w="1928"/>
       </w:tblGrid>
       <w:tr>
         <w:tc>
           <w:tcPr>
-            <w:tcW w:type="dxa" w:w="1871"/>
+            <w:tcW w:type="dxa" w:w="1928"/>
           </w:tcPr>
           <w:p>
             <w:pPr>
@@ -4392,7 +4404,7 @@
         </w:tc>
         <w:tc>
           <w:tcPr>
-            <w:tcW w:type="dxa" w:w="1871"/>
+            <w:tcW w:type="dxa" w:w="1928"/>
           </w:tcPr>
           <w:p>
             <w:pPr>
@@ -4411,7 +4423,7 @@
         </w:tc>
         <w:tc>
           <w:tcPr>
-            <w:tcW w:type="dxa" w:w="1871"/>
+            <w:tcW w:type="dxa" w:w="1928"/>
           </w:tcPr>
           <w:p>
             <w:pPr>
@@ -4430,7 +4442,7 @@
         </w:tc>
         <w:tc>
           <w:tcPr>
-            <w:tcW w:type="dxa" w:w="1871"/>
+            <w:tcW w:type="dxa" w:w="1928"/>
           </w:tcPr>
           <w:p>
             <w:pPr>
@@ -4449,7 +4461,7 @@
         </w:tc>
         <w:tc>
           <w:tcPr>
-            <w:tcW w:type="dxa" w:w="1871"/>
+            <w:tcW w:type="dxa" w:w="1928"/>
           </w:tcPr>
           <w:p>
             <w:pPr>
@@ -4470,7 +4482,7 @@
       <w:tr>
         <w:tc>
           <w:tcPr>
-            <w:tcW w:type="dxa" w:w="1871"/>
+            <w:tcW w:type="dxa" w:w="1928"/>
           </w:tcPr>
           <w:p>
             <w:pPr>
@@ -4488,7 +4500,7 @@
         </w:tc>
         <w:tc>
           <w:tcPr>
-            <w:tcW w:type="dxa" w:w="1871"/>
+            <w:tcW w:type="dxa" w:w="1928"/>
           </w:tcPr>
           <w:p>
             <w:pPr>
@@ -4506,7 +4518,7 @@
         </w:tc>
         <w:tc>
           <w:tcPr>
-            <w:tcW w:type="dxa" w:w="1871"/>
+            <w:tcW w:type="dxa" w:w="1928"/>
           </w:tcPr>
           <w:p>
             <w:pPr>
@@ -4524,7 +4536,7 @@
         </w:tc>
         <w:tc>
           <w:tcPr>
-            <w:tcW w:type="dxa" w:w="1871"/>
+            <w:tcW w:type="dxa" w:w="1928"/>
           </w:tcPr>
           <w:p>
             <w:pPr>
@@ -4542,7 +4554,7 @@
         </w:tc>
         <w:tc>
           <w:tcPr>
-            <w:tcW w:type="dxa" w:w="1871"/>
+            <w:tcW w:type="dxa" w:w="1928"/>
           </w:tcPr>
           <w:p>
             <w:pPr>
@@ -4562,7 +4574,7 @@
       <w:tr>
         <w:tc>
           <w:tcPr>
-            <w:tcW w:type="dxa" w:w="1871"/>
+            <w:tcW w:type="dxa" w:w="1928"/>
           </w:tcPr>
           <w:p>
             <w:pPr>
@@ -4580,7 +4592,7 @@
         </w:tc>
         <w:tc>
           <w:tcPr>
-            <w:tcW w:type="dxa" w:w="1871"/>
+            <w:tcW w:type="dxa" w:w="1928"/>
           </w:tcPr>
           <w:p>
             <w:pPr>
@@ -4598,7 +4610,7 @@
         </w:tc>
         <w:tc>
           <w:tcPr>
-            <w:tcW w:type="dxa" w:w="1871"/>
+            <w:tcW w:type="dxa" w:w="1928"/>
           </w:tcPr>
           <w:p>
             <w:pPr>
@@ -4616,7 +4628,7 @@
         </w:tc>
         <w:tc>
           <w:tcPr>
-            <w:tcW w:type="dxa" w:w="1871"/>
+            <w:tcW w:type="dxa" w:w="1928"/>
           </w:tcPr>
           <w:p>
             <w:pPr>
@@ -4634,7 +4646,7 @@
         </w:tc>
         <w:tc>
           <w:tcPr>
-            <w:tcW w:type="dxa" w:w="1871"/>
+            <w:tcW w:type="dxa" w:w="1928"/>
           </w:tcPr>
           <w:p>
             <w:pPr>
@@ -4654,7 +4666,7 @@
       <w:tr>
         <w:tc>
           <w:tcPr>
-            <w:tcW w:type="dxa" w:w="1871"/>
+            <w:tcW w:type="dxa" w:w="1928"/>
           </w:tcPr>
           <w:p>
             <w:pPr>
@@ -4672,7 +4684,7 @@
         </w:tc>
         <w:tc>
           <w:tcPr>
-            <w:tcW w:type="dxa" w:w="1871"/>
+            <w:tcW w:type="dxa" w:w="1928"/>
           </w:tcPr>
           <w:p>
             <w:pPr>
@@ -4690,7 +4702,7 @@
         </w:tc>
         <w:tc>
           <w:tcPr>
-            <w:tcW w:type="dxa" w:w="1871"/>
+            <w:tcW w:type="dxa" w:w="1928"/>
           </w:tcPr>
           <w:p>
             <w:pPr>
@@ -4708,7 +4720,7 @@
         </w:tc>
         <w:tc>
           <w:tcPr>
-            <w:tcW w:type="dxa" w:w="1871"/>
+            <w:tcW w:type="dxa" w:w="1928"/>
           </w:tcPr>
           <w:p>
             <w:pPr>
@@ -4726,7 +4738,7 @@
         </w:tc>
         <w:tc>
           <w:tcPr>
-            <w:tcW w:type="dxa" w:w="1871"/>
+            <w:tcW w:type="dxa" w:w="1928"/>
           </w:tcPr>
           <w:p>
             <w:pPr>
@@ -4746,7 +4758,7 @@
       <w:tr>
         <w:tc>
           <w:tcPr>
-            <w:tcW w:type="dxa" w:w="1871"/>
+            <w:tcW w:type="dxa" w:w="1928"/>
           </w:tcPr>
           <w:p>
             <w:pPr>
@@ -4764,7 +4776,7 @@
         </w:tc>
         <w:tc>
           <w:tcPr>
-            <w:tcW w:type="dxa" w:w="1871"/>
+            <w:tcW w:type="dxa" w:w="1928"/>
           </w:tcPr>
           <w:p>
             <w:pPr>
@@ -4782,7 +4794,7 @@
         </w:tc>
         <w:tc>
           <w:tcPr>
-            <w:tcW w:type="dxa" w:w="1871"/>
+            <w:tcW w:type="dxa" w:w="1928"/>
           </w:tcPr>
           <w:p>
             <w:pPr>
@@ -4800,7 +4812,7 @@
         </w:tc>
         <w:tc>
           <w:tcPr>
-            <w:tcW w:type="dxa" w:w="1871"/>
+            <w:tcW w:type="dxa" w:w="1928"/>
           </w:tcPr>
           <w:p>
             <w:pPr>
@@ -4818,7 +4830,7 @@
         </w:tc>
         <w:tc>
           <w:tcPr>
-            <w:tcW w:type="dxa" w:w="1871"/>
+            <w:tcW w:type="dxa" w:w="1928"/>
           </w:tcPr>
           <w:p>
             <w:pPr>
@@ -4838,7 +4850,7 @@
       <w:tr>
         <w:tc>
           <w:tcPr>
-            <w:tcW w:type="dxa" w:w="1871"/>
+            <w:tcW w:type="dxa" w:w="1928"/>
           </w:tcPr>
           <w:p>
             <w:pPr>
@@ -4856,7 +4868,7 @@
         </w:tc>
         <w:tc>
           <w:tcPr>
-            <w:tcW w:type="dxa" w:w="1871"/>
+            <w:tcW w:type="dxa" w:w="1928"/>
           </w:tcPr>
           <w:p>
             <w:pPr>
@@ -4874,7 +4886,7 @@
         </w:tc>
         <w:tc>
           <w:tcPr>
-            <w:tcW w:type="dxa" w:w="1871"/>
+            <w:tcW w:type="dxa" w:w="1928"/>
           </w:tcPr>
           <w:p>
             <w:pPr>
@@ -4892,7 +4904,7 @@
         </w:tc>
         <w:tc>
           <w:tcPr>
-            <w:tcW w:type="dxa" w:w="1871"/>
+            <w:tcW w:type="dxa" w:w="1928"/>
           </w:tcPr>
           <w:p>
             <w:pPr>
@@ -4910,7 +4922,7 @@
         </w:tc>
         <w:tc>
           <w:tcPr>
-            <w:tcW w:type="dxa" w:w="1871"/>
+            <w:tcW w:type="dxa" w:w="1928"/>
           </w:tcPr>
           <w:p>
             <w:pPr>
@@ -4930,7 +4942,7 @@
       <w:tr>
         <w:tc>
           <w:tcPr>
-            <w:tcW w:type="dxa" w:w="1871"/>
+            <w:tcW w:type="dxa" w:w="1928"/>
           </w:tcPr>
           <w:p>
             <w:pPr>
@@ -4948,7 +4960,7 @@
         </w:tc>
         <w:tc>
           <w:tcPr>
-            <w:tcW w:type="dxa" w:w="1871"/>
+            <w:tcW w:type="dxa" w:w="1928"/>
           </w:tcPr>
           <w:p>
             <w:pPr>
@@ -4966,7 +4978,7 @@
         </w:tc>
         <w:tc>
           <w:tcPr>
-            <w:tcW w:type="dxa" w:w="1871"/>
+            <w:tcW w:type="dxa" w:w="1928"/>
           </w:tcPr>
           <w:p>
             <w:pPr>
@@ -4984,7 +4996,7 @@
         </w:tc>
         <w:tc>
           <w:tcPr>
-            <w:tcW w:type="dxa" w:w="1871"/>
+            <w:tcW w:type="dxa" w:w="1928"/>
           </w:tcPr>
           <w:p>
             <w:pPr>
@@ -5002,7 +5014,7 @@
         </w:tc>
         <w:tc>
           <w:tcPr>
-            <w:tcW w:type="dxa" w:w="1871"/>
+            <w:tcW w:type="dxa" w:w="1928"/>
           </w:tcPr>
           <w:p>
             <w:pPr>
@@ -5022,7 +5034,7 @@
       <w:tr>
         <w:tc>
           <w:tcPr>
-            <w:tcW w:type="dxa" w:w="1871"/>
+            <w:tcW w:type="dxa" w:w="1928"/>
           </w:tcPr>
           <w:p>
             <w:pPr>
@@ -5040,7 +5052,7 @@
         </w:tc>
         <w:tc>
           <w:tcPr>
-            <w:tcW w:type="dxa" w:w="1871"/>
+            <w:tcW w:type="dxa" w:w="1928"/>
           </w:tcPr>
           <w:p>
             <w:pPr>
@@ -5058,7 +5070,7 @@
         </w:tc>
         <w:tc>
           <w:tcPr>
-            <w:tcW w:type="dxa" w:w="1871"/>
+            <w:tcW w:type="dxa" w:w="1928"/>
           </w:tcPr>
           <w:p>
             <w:pPr>
@@ -5076,7 +5088,7 @@
         </w:tc>
         <w:tc>
           <w:tcPr>
-            <w:tcW w:type="dxa" w:w="1871"/>
+            <w:tcW w:type="dxa" w:w="1928"/>
           </w:tcPr>
           <w:p>
             <w:pPr>
@@ -5094,7 +5106,7 @@
         </w:tc>
         <w:tc>
           <w:tcPr>
-            <w:tcW w:type="dxa" w:w="1871"/>
+            <w:tcW w:type="dxa" w:w="1928"/>
           </w:tcPr>
           <w:p>
             <w:pPr>
@@ -5114,7 +5126,7 @@
       <w:tr>
         <w:tc>
           <w:tcPr>
-            <w:tcW w:type="dxa" w:w="1871"/>
+            <w:tcW w:type="dxa" w:w="1928"/>
           </w:tcPr>
           <w:p>
             <w:pPr>
@@ -5132,7 +5144,7 @@
         </w:tc>
         <w:tc>
           <w:tcPr>
-            <w:tcW w:type="dxa" w:w="1871"/>
+            <w:tcW w:type="dxa" w:w="1928"/>
           </w:tcPr>
           <w:p>
             <w:pPr>
@@ -5150,7 +5162,7 @@
         </w:tc>
         <w:tc>
           <w:tcPr>
-            <w:tcW w:type="dxa" w:w="1871"/>
+            <w:tcW w:type="dxa" w:w="1928"/>
           </w:tcPr>
           <w:p>
             <w:pPr>
@@ -5168,7 +5180,7 @@
         </w:tc>
         <w:tc>
           <w:tcPr>
-            <w:tcW w:type="dxa" w:w="1871"/>
+            <w:tcW w:type="dxa" w:w="1928"/>
           </w:tcPr>
           <w:p>
             <w:pPr>
@@ -5186,7 +5198,7 @@
         </w:tc>
         <w:tc>
           <w:tcPr>
-            <w:tcW w:type="dxa" w:w="1871"/>
+            <w:tcW w:type="dxa" w:w="1928"/>
           </w:tcPr>
           <w:p>
             <w:pPr>
@@ -5206,7 +5218,7 @@
       <w:tr>
         <w:tc>
           <w:tcPr>
-            <w:tcW w:type="dxa" w:w="1871"/>
+            <w:tcW w:type="dxa" w:w="1928"/>
           </w:tcPr>
           <w:p>
             <w:pPr>
@@ -5224,7 +5236,7 @@
         </w:tc>
         <w:tc>
           <w:tcPr>
-            <w:tcW w:type="dxa" w:w="1871"/>
+            <w:tcW w:type="dxa" w:w="1928"/>
           </w:tcPr>
           <w:p>
             <w:pPr>
@@ -5242,7 +5254,7 @@
         </w:tc>
         <w:tc>
           <w:tcPr>
-            <w:tcW w:type="dxa" w:w="1871"/>
+            <w:tcW w:type="dxa" w:w="1928"/>
           </w:tcPr>
           <w:p>
             <w:pPr>
@@ -5260,7 +5272,7 @@
         </w:tc>
         <w:tc>
           <w:tcPr>
-            <w:tcW w:type="dxa" w:w="1871"/>
+            <w:tcW w:type="dxa" w:w="1928"/>
           </w:tcPr>
           <w:p>
             <w:pPr>
@@ -5278,7 +5290,7 @@
         </w:tc>
         <w:tc>
           <w:tcPr>
-            <w:tcW w:type="dxa" w:w="1871"/>
+            <w:tcW w:type="dxa" w:w="1928"/>
           </w:tcPr>
           <w:p>
             <w:pPr>
@@ -5322,13 +5334,13 @@
         <w:tblLook w:firstColumn="1" w:firstRow="1" w:lastColumn="0" w:lastRow="0" w:noHBand="0" w:noVBand="1" w:val="04A0"/>
       </w:tblPr>
       <w:tblGrid>
-        <w:gridCol w:w="4677"/>
-        <w:gridCol w:w="4677"/>
+        <w:gridCol w:w="4819"/>
+        <w:gridCol w:w="4819"/>
       </w:tblGrid>
       <w:tr>
         <w:tc>
           <w:tcPr>
-            <w:tcW w:type="dxa" w:w="4677"/>
+            <w:tcW w:type="dxa" w:w="4819"/>
           </w:tcPr>
           <w:p>
             <w:pPr>
@@ -5347,7 +5359,7 @@
         </w:tc>
         <w:tc>
           <w:tcPr>
-            <w:tcW w:type="dxa" w:w="4677"/>
+            <w:tcW w:type="dxa" w:w="4819"/>
           </w:tcPr>
           <w:p>
             <w:pPr>
@@ -5368,7 +5380,7 @@
       <w:tr>
         <w:tc>
           <w:tcPr>
-            <w:tcW w:type="dxa" w:w="4677"/>
+            <w:tcW w:type="dxa" w:w="4819"/>
           </w:tcPr>
           <w:p>
             <w:pPr>
@@ -5386,7 +5398,7 @@
         </w:tc>
         <w:tc>
           <w:tcPr>
-            <w:tcW w:type="dxa" w:w="4677"/>
+            <w:tcW w:type="dxa" w:w="4819"/>
           </w:tcPr>
           <w:p>
             <w:pPr>
@@ -5406,7 +5418,7 @@
       <w:tr>
         <w:tc>
           <w:tcPr>
-            <w:tcW w:type="dxa" w:w="4677"/>
+            <w:tcW w:type="dxa" w:w="4819"/>
           </w:tcPr>
           <w:p>
             <w:pPr>
@@ -5424,7 +5436,7 @@
         </w:tc>
         <w:tc>
           <w:tcPr>
-            <w:tcW w:type="dxa" w:w="4677"/>
+            <w:tcW w:type="dxa" w:w="4819"/>
           </w:tcPr>
           <w:p>
             <w:pPr>
@@ -5444,7 +5456,7 @@
       <w:tr>
         <w:tc>
           <w:tcPr>
-            <w:tcW w:type="dxa" w:w="4677"/>
+            <w:tcW w:type="dxa" w:w="4819"/>
           </w:tcPr>
           <w:p>
             <w:pPr>
@@ -5462,7 +5474,7 @@
         </w:tc>
         <w:tc>
           <w:tcPr>
-            <w:tcW w:type="dxa" w:w="4677"/>
+            <w:tcW w:type="dxa" w:w="4819"/>
           </w:tcPr>
           <w:p>
             <w:pPr>
@@ -5482,7 +5494,7 @@
       <w:tr>
         <w:tc>
           <w:tcPr>
-            <w:tcW w:type="dxa" w:w="4677"/>
+            <w:tcW w:type="dxa" w:w="4819"/>
           </w:tcPr>
           <w:p>
             <w:pPr>
@@ -5500,7 +5512,7 @@
         </w:tc>
         <w:tc>
           <w:tcPr>
-            <w:tcW w:type="dxa" w:w="4677"/>
+            <w:tcW w:type="dxa" w:w="4819"/>
           </w:tcPr>
           <w:p>
             <w:pPr>
@@ -5520,7 +5532,7 @@
       <w:tr>
         <w:tc>
           <w:tcPr>
-            <w:tcW w:type="dxa" w:w="4677"/>
+            <w:tcW w:type="dxa" w:w="4819"/>
           </w:tcPr>
           <w:p>
             <w:pPr>
@@ -5538,7 +5550,7 @@
         </w:tc>
         <w:tc>
           <w:tcPr>
-            <w:tcW w:type="dxa" w:w="4677"/>
+            <w:tcW w:type="dxa" w:w="4819"/>
           </w:tcPr>
           <w:p>
             <w:pPr>
@@ -5558,7 +5570,7 @@
       <w:tr>
         <w:tc>
           <w:tcPr>
-            <w:tcW w:type="dxa" w:w="4677"/>
+            <w:tcW w:type="dxa" w:w="4819"/>
           </w:tcPr>
           <w:p>
             <w:pPr>
@@ -5576,7 +5588,7 @@
         </w:tc>
         <w:tc>
           <w:tcPr>
-            <w:tcW w:type="dxa" w:w="4677"/>
+            <w:tcW w:type="dxa" w:w="4819"/>
           </w:tcPr>
           <w:p>
             <w:pPr>
@@ -5596,7 +5608,7 @@
       <w:tr>
         <w:tc>
           <w:tcPr>
-            <w:tcW w:type="dxa" w:w="4677"/>
+            <w:tcW w:type="dxa" w:w="4819"/>
           </w:tcPr>
           <w:p>
             <w:pPr>
@@ -5614,7 +5626,7 @@
         </w:tc>
         <w:tc>
           <w:tcPr>
-            <w:tcW w:type="dxa" w:w="4677"/>
+            <w:tcW w:type="dxa" w:w="4819"/>
           </w:tcPr>
           <w:p>
             <w:pPr>
@@ -5634,7 +5646,7 @@
       <w:tr>
         <w:tc>
           <w:tcPr>
-            <w:tcW w:type="dxa" w:w="4677"/>
+            <w:tcW w:type="dxa" w:w="4819"/>
           </w:tcPr>
           <w:p>
             <w:pPr>
@@ -5652,7 +5664,7 @@
         </w:tc>
         <w:tc>
           <w:tcPr>
-            <w:tcW w:type="dxa" w:w="4677"/>
+            <w:tcW w:type="dxa" w:w="4819"/>
           </w:tcPr>
           <w:p>
             <w:pPr>
@@ -6551,8 +6563,9 @@
     <w:sectPr>
       <w:footerReference w:type="default" r:id="rId9"/>
       <w:pgSz w:w="11906" w:h="16838"/>
-      <w:pgMar w:top="1134" w:right="850" w:bottom="1134" w:left="1701" w:header="720" w:footer="720" w:gutter="0"/>
+      <w:pgMar w:top="1134" w:right="567" w:bottom="1134" w:left="1701" w:header="720" w:footer="720" w:gutter="0"/>
       <w:cols w:space="720"/>
+      <w:titlePg/>
       <w:docGrid w:linePitch="360"/>
     </w:sectPr>
   </w:body>
@@ -6566,9 +6579,6 @@
       <w:pStyle w:val="Footer"/>
       <w:jc w:val="center"/>
     </w:pPr>
-    <w:r>
-      <w:t xml:space="preserve">Стр. </w:t>
-    </w:r>
     <w:fldSimple w:instr="PAGE"/>
   </w:p>
 </w:ftr>

</xml_diff>